<commit_message>
Fixed some formatting issues with README
</commit_message>
<xml_diff>
--- a/Write Ups/PeopleFirst Software Requirements Specification.docx
+++ b/Write Ups/PeopleFirst Software Requirements Specification.docx
@@ -489,18 +489,7 @@
           <w:sz w:val="24"/>
           <w:szCs w:val="24"/>
         </w:rPr>
-        <w:t>2.</w:t>
-      </w:r>
-      <w:r>
-        <w:rPr>
-          <w:rFonts w:ascii="Times New Roman" w:eastAsia="Times New Roman" w:hAnsi="Times New Roman" w:cs="Times New Roman"/>
-          <w:b/>
-          <w:bCs/>
-          <w:color w:val="000A1B"/>
-          <w:sz w:val="24"/>
-          <w:szCs w:val="24"/>
-        </w:rPr>
-        <w:t>3 Identification of Case Study</w:t>
+        <w:t>2.3 Identification of Case Study</w:t>
       </w:r>
     </w:p>
     <w:p>
@@ -568,18 +557,7 @@
           <w:sz w:val="24"/>
           <w:szCs w:val="24"/>
         </w:rPr>
-        <w:t>2.</w:t>
-      </w:r>
-      <w:r>
-        <w:rPr>
-          <w:rFonts w:ascii="Times New Roman" w:eastAsia="Times New Roman" w:hAnsi="Times New Roman" w:cs="Times New Roman"/>
-          <w:b/>
-          <w:bCs/>
-          <w:color w:val="000A1B"/>
-          <w:sz w:val="24"/>
-          <w:szCs w:val="24"/>
-        </w:rPr>
-        <w:t>4 Areas of Responsibilities</w:t>
+        <w:t>2.4 Areas of Responsibilities</w:t>
       </w:r>
     </w:p>
     <w:p>
@@ -601,7 +579,34 @@
           <w:szCs w:val="24"/>
         </w:rPr>
         <w:lastRenderedPageBreak/>
-        <w:t>Quamez Anderson - Primary: AI Chatbot, Testing; Secondary: Forums</w:t>
+        <w:t xml:space="preserve">Quamez Anderson - Primary: AI Chatbot, </w:t>
+      </w:r>
+      <w:r>
+        <w:rPr>
+          <w:rFonts w:ascii="Times New Roman" w:eastAsia="Times New Roman" w:hAnsi="Times New Roman" w:cs="Times New Roman"/>
+          <w:color w:val="000A1B"/>
+          <w:sz w:val="24"/>
+          <w:szCs w:val="24"/>
+        </w:rPr>
+        <w:t>API</w:t>
+      </w:r>
+      <w:r>
+        <w:rPr>
+          <w:rFonts w:ascii="Times New Roman" w:eastAsia="Times New Roman" w:hAnsi="Times New Roman" w:cs="Times New Roman"/>
+          <w:color w:val="000A1B"/>
+          <w:sz w:val="24"/>
+          <w:szCs w:val="24"/>
+        </w:rPr>
+        <w:t xml:space="preserve">; Secondary: </w:t>
+      </w:r>
+      <w:r>
+        <w:rPr>
+          <w:rFonts w:ascii="Times New Roman" w:eastAsia="Times New Roman" w:hAnsi="Times New Roman" w:cs="Times New Roman"/>
+          <w:color w:val="000A1B"/>
+          <w:sz w:val="24"/>
+          <w:szCs w:val="24"/>
+        </w:rPr>
+        <w:t>UI</w:t>
       </w:r>
     </w:p>
     <w:p>
@@ -622,7 +627,16 @@
           <w:sz w:val="24"/>
           <w:szCs w:val="24"/>
         </w:rPr>
-        <w:t>Bryson Coons - Primary: Database; Secondary: Login Interface</w:t>
+        <w:t xml:space="preserve">Bryson Coons - Primary: Database; Secondary: </w:t>
+      </w:r>
+      <w:r>
+        <w:rPr>
+          <w:rFonts w:ascii="Times New Roman" w:eastAsia="Times New Roman" w:hAnsi="Times New Roman" w:cs="Times New Roman"/>
+          <w:color w:val="000A1B"/>
+          <w:sz w:val="24"/>
+          <w:szCs w:val="24"/>
+        </w:rPr>
+        <w:t>API</w:t>
       </w:r>
     </w:p>
     <w:p>
@@ -643,7 +657,34 @@
           <w:sz w:val="24"/>
           <w:szCs w:val="24"/>
         </w:rPr>
-        <w:t>Isaiah Hara - Primary: Resources; Secondary: Documentation</w:t>
+        <w:t xml:space="preserve">Isaiah Hara - Primary: </w:t>
+      </w:r>
+      <w:r>
+        <w:rPr>
+          <w:rFonts w:ascii="Times New Roman" w:eastAsia="Times New Roman" w:hAnsi="Times New Roman" w:cs="Times New Roman"/>
+          <w:color w:val="000A1B"/>
+          <w:sz w:val="24"/>
+          <w:szCs w:val="24"/>
+        </w:rPr>
+        <w:t>Backend</w:t>
+      </w:r>
+      <w:r>
+        <w:rPr>
+          <w:rFonts w:ascii="Times New Roman" w:eastAsia="Times New Roman" w:hAnsi="Times New Roman" w:cs="Times New Roman"/>
+          <w:color w:val="000A1B"/>
+          <w:sz w:val="24"/>
+          <w:szCs w:val="24"/>
+        </w:rPr>
+        <w:t xml:space="preserve">; Secondary: </w:t>
+      </w:r>
+      <w:r>
+        <w:rPr>
+          <w:rFonts w:ascii="Times New Roman" w:eastAsia="Times New Roman" w:hAnsi="Times New Roman" w:cs="Times New Roman"/>
+          <w:color w:val="000A1B"/>
+          <w:sz w:val="24"/>
+          <w:szCs w:val="24"/>
+        </w:rPr>
+        <w:t>UI</w:t>
       </w:r>
     </w:p>
     <w:p>
@@ -664,7 +705,34 @@
           <w:sz w:val="24"/>
           <w:szCs w:val="24"/>
         </w:rPr>
-        <w:t>David Kabengala - Primary: Login Interface; Secondary: Database</w:t>
+        <w:t xml:space="preserve">David Kabengala - Primary: </w:t>
+      </w:r>
+      <w:r>
+        <w:rPr>
+          <w:rFonts w:ascii="Times New Roman" w:eastAsia="Times New Roman" w:hAnsi="Times New Roman" w:cs="Times New Roman"/>
+          <w:color w:val="000A1B"/>
+          <w:sz w:val="24"/>
+          <w:szCs w:val="24"/>
+        </w:rPr>
+        <w:t>UI</w:t>
+      </w:r>
+      <w:r>
+        <w:rPr>
+          <w:rFonts w:ascii="Times New Roman" w:eastAsia="Times New Roman" w:hAnsi="Times New Roman" w:cs="Times New Roman"/>
+          <w:color w:val="000A1B"/>
+          <w:sz w:val="24"/>
+          <w:szCs w:val="24"/>
+        </w:rPr>
+        <w:t xml:space="preserve">; Secondary: </w:t>
+      </w:r>
+      <w:r>
+        <w:rPr>
+          <w:rFonts w:ascii="Times New Roman" w:eastAsia="Times New Roman" w:hAnsi="Times New Roman" w:cs="Times New Roman"/>
+          <w:color w:val="000A1B"/>
+          <w:sz w:val="24"/>
+          <w:szCs w:val="24"/>
+        </w:rPr>
+        <w:t>API</w:t>
       </w:r>
     </w:p>
     <w:p>
@@ -685,7 +753,16 @@
           <w:sz w:val="24"/>
           <w:szCs w:val="24"/>
         </w:rPr>
-        <w:t>Alaya Mateo - Primary: Documentation; Secondary: Forums</w:t>
+        <w:t xml:space="preserve">Alaya Mateo - Primary: Documentation; Secondary: </w:t>
+      </w:r>
+      <w:r>
+        <w:rPr>
+          <w:rFonts w:ascii="Times New Roman" w:eastAsia="Times New Roman" w:hAnsi="Times New Roman" w:cs="Times New Roman"/>
+          <w:color w:val="000A1B"/>
+          <w:sz w:val="24"/>
+          <w:szCs w:val="24"/>
+        </w:rPr>
+        <w:t>UI</w:t>
       </w:r>
     </w:p>
     <w:p>
@@ -708,18 +785,7 @@
           <w:sz w:val="24"/>
           <w:szCs w:val="24"/>
         </w:rPr>
-        <w:t>2.5</w:t>
-      </w:r>
-      <w:r>
-        <w:rPr>
-          <w:rFonts w:ascii="Times New Roman" w:eastAsia="Times New Roman" w:hAnsi="Times New Roman" w:cs="Times New Roman"/>
-          <w:b/>
-          <w:bCs/>
-          <w:color w:val="000A1B"/>
-          <w:sz w:val="24"/>
-          <w:szCs w:val="24"/>
-        </w:rPr>
-        <w:t xml:space="preserve"> Changes from Design Phase</w:t>
+        <w:t>2.5 Changes from Design Phase</w:t>
       </w:r>
     </w:p>
     <w:p>
@@ -1760,18 +1826,7 @@
           <w:szCs w:val="24"/>
         </w:rPr>
         <w:lastRenderedPageBreak/>
-        <w:t>4.</w:t>
-      </w:r>
-      <w:r>
-        <w:rPr>
-          <w:rFonts w:ascii="Times New Roman" w:eastAsia="Times New Roman" w:hAnsi="Times New Roman" w:cs="Times New Roman"/>
-          <w:b/>
-          <w:bCs/>
-          <w:color w:val="000A1B"/>
-          <w:sz w:val="24"/>
-          <w:szCs w:val="24"/>
-        </w:rPr>
-        <w:t xml:space="preserve"> Glossary</w:t>
+        <w:t>4. Glossary</w:t>
       </w:r>
     </w:p>
     <w:p>
@@ -1893,7 +1948,18 @@
           <w:szCs w:val="24"/>
         </w:rPr>
         <w:lastRenderedPageBreak/>
-        <w:t>7. References</w:t>
+        <w:t>5</w:t>
+      </w:r>
+      <w:r>
+        <w:rPr>
+          <w:rFonts w:ascii="Times New Roman" w:eastAsia="Times New Roman" w:hAnsi="Times New Roman" w:cs="Times New Roman"/>
+          <w:b/>
+          <w:bCs/>
+          <w:color w:val="000A1B"/>
+          <w:sz w:val="24"/>
+          <w:szCs w:val="24"/>
+        </w:rPr>
+        <w:t>. References</w:t>
       </w:r>
     </w:p>
     <w:p>

</xml_diff>